<commit_message>
feat: add controlled CRAG evaluation and repair
</commit_message>
<xml_diff>
--- a/doichieukientruc.docx
+++ b/doichieukientruc.docx
@@ -113,7 +113,7 @@
     </w:p>
     <w:p>
       <w:r>
-        <w:br w:type="page"/>
+        <w:t>Bản hiệu chỉnh sau khi đối chiếu source code và telemetry tại commit 0d757c8.</w:t>
       </w:r>
     </w:p>
     <w:p>
@@ -375,10 +375,7 @@
     </w:p>
     <w:p>
       <w:r>
-        <w:rPr>
-          <w:b/>
-        </w:rPr>
-        <w:t>Có thể áp dụng cả bốn hướng, nhưng không nên triển khai đồng loạt và không nên bắt đầu bằng GraphRAG.</w:t>
+        <w:t>Có thể áp dụng cả bốn hướng, nhưng không nên triển khai đồng loạt. Ưu tiên đầu tiên phải là chuẩn hóa telemetry và xây tập đánh giá có nhãn; sau đó mới triển khai correction/repair. Không nên bắt đầu bằng GraphRAG.</w:t>
       </w:r>
     </w:p>
     <w:p>
@@ -386,7 +383,7 @@
         <w:pStyle w:val="ListNumber"/>
       </w:pPr>
       <w:r>
-        <w:t>CRAG có kiểm soát — ưu tiên P0</w:t>
+        <w:t>Telemetry và labeled evaluation — P0</w:t>
       </w:r>
     </w:p>
     <w:p>
@@ -394,7 +391,7 @@
         <w:pStyle w:val="ListNumber"/>
       </w:pPr>
       <w:r>
-        <w:t>Late Interaction/ColBERT như tầng rerank — P0/P1</w:t>
+        <w:t>CRAG có kiểm soát và claim-level repair — P0/P1</w:t>
       </w:r>
     </w:p>
     <w:p>
@@ -402,7 +399,7 @@
         <w:pStyle w:val="ListNumber"/>
       </w:pPr>
       <w:r>
-        <w:t>Query Decomposition có điều kiện — P1</w:t>
+        <w:t>Late Interaction như tầng rerank — P1</w:t>
       </w:r>
     </w:p>
     <w:p>
@@ -410,7 +407,7 @@
         <w:pStyle w:val="ListNumber"/>
       </w:pPr>
       <w:r>
-        <w:t>GraphRAG chọn lọc cho truy vấn quan hệ/tổng hợp — P2</w:t>
+        <w:t>Query Decomposition có điều kiện — P1; GraphRAG chọn lọc — P2</w:t>
       </w:r>
     </w:p>
     <w:tbl>
@@ -437,13 +434,7 @@
           </w:tcPr>
           <w:p>
             <w:r>
-              <w:rPr>
-                <w:b/>
-              </w:rPr>
-              <w:t xml:space="preserve">Phát hiện quan trọng: </w:t>
-            </w:r>
-            <w:r>
-              <w:t>Nút thắt lớn nhất hiện tại không phải bản thân Evidence Gate, mà là post-check số liệu chạy quá rộng và việc hệ thống từ chối ngay sau lần retrieval thất bại.</w:t>
+              <w:t>Phát hiện quan trọng: telemetry hiện cho thấy post-check số và retrieval rỗng đáng điều tra hơn Evidence Gate block, nhưng chưa có labeled ground truth để gọi đó là False Negative hoặc xác định nút thắt lớn nhất.</w:t>
             </w:r>
           </w:p>
         </w:tc>
@@ -486,137 +477,10 @@
             </w:tcBorders>
           </w:tcPr>
           <w:p>
-            <w:pPr>
-              <w:spacing w:after="0"/>
-            </w:pPr>
             <w:r>
-              <w:rPr>
-                <w:rFonts w:ascii="Consolas" w:hAnsi="Consolas"/>
-                <w:color w:val="2C2C2B"/>
-                <w:sz w:val="17"/>
-              </w:rPr>
-              <w:t>Safety</w:t>
-            </w:r>
-            <w:r>
+              <w:t>Safety → cache → Interaction Router → rewrite/anchoring → intent/entity/version → governance filters → dense BGE-M3 + BM25 → RRF</w:t>
               <w:br/>
-            </w:r>
-            <w:r>
-              <w:rPr>
-                <w:rFonts w:ascii="Consolas" w:hAnsi="Consolas"/>
-                <w:color w:val="2C2C2B"/>
-                <w:sz w:val="17"/>
-              </w:rPr>
-              <w:t>→ Exact/Semantic cache</w:t>
-            </w:r>
-            <w:r>
-              <w:br/>
-            </w:r>
-            <w:r>
-              <w:rPr>
-                <w:rFonts w:ascii="Consolas" w:hAnsi="Consolas"/>
-                <w:color w:val="2C2C2B"/>
-                <w:sz w:val="17"/>
-              </w:rPr>
-              <w:t>→ Interaction Router</w:t>
-            </w:r>
-            <w:r>
-              <w:br/>
-            </w:r>
-            <w:r>
-              <w:rPr>
-                <w:rFonts w:ascii="Consolas" w:hAnsi="Consolas"/>
-                <w:color w:val="2C2C2B"/>
-                <w:sz w:val="17"/>
-              </w:rPr>
-              <w:t>→ Context rewrite + conversation anchoring</w:t>
-            </w:r>
-            <w:r>
-              <w:br/>
-            </w:r>
-            <w:r>
-              <w:rPr>
-                <w:rFonts w:ascii="Consolas" w:hAnsi="Consolas"/>
-                <w:color w:val="2C2C2B"/>
-                <w:sz w:val="17"/>
-              </w:rPr>
-              <w:t>→ Intent/entity/version extraction</w:t>
-            </w:r>
-            <w:r>
-              <w:br/>
-            </w:r>
-            <w:r>
-              <w:rPr>
-                <w:rFonts w:ascii="Consolas" w:hAnsi="Consolas"/>
-                <w:color w:val="2C2C2B"/>
-                <w:sz w:val="17"/>
-              </w:rPr>
-              <w:t>→ RBAC + site + lifecycle + publication filters</w:t>
-            </w:r>
-            <w:r>
-              <w:br/>
-            </w:r>
-            <w:r>
-              <w:rPr>
-                <w:rFonts w:ascii="Consolas" w:hAnsi="Consolas"/>
-                <w:color w:val="2C2C2B"/>
-                <w:sz w:val="17"/>
-              </w:rPr>
-              <w:t>→ Dense BGE-M3 + BM25 → RRF</w:t>
-            </w:r>
-            <w:r>
-              <w:br/>
-            </w:r>
-            <w:r>
-              <w:rPr>
-                <w:rFonts w:ascii="Consolas" w:hAnsi="Consolas"/>
-                <w:color w:val="2C2C2B"/>
-                <w:sz w:val="17"/>
-              </w:rPr>
-              <w:t>→ HyDE nếu retrieval rỗng</w:t>
-            </w:r>
-            <w:r>
-              <w:br/>
-            </w:r>
-            <w:r>
-              <w:rPr>
-                <w:rFonts w:ascii="Consolas" w:hAnsi="Consolas"/>
-                <w:color w:val="2C2C2B"/>
-                <w:sz w:val="17"/>
-              </w:rPr>
-              <w:t>→ Entity disambiguation → SQL BOM injection</w:t>
-            </w:r>
-            <w:r>
-              <w:br/>
-            </w:r>
-            <w:r>
-              <w:rPr>
-                <w:rFonts w:ascii="Consolas" w:hAnsi="Consolas"/>
-                <w:color w:val="2C2C2B"/>
-                <w:sz w:val="17"/>
-              </w:rPr>
-              <w:t>→ Candidate diversification → Voyage rerank/local fallback</w:t>
-            </w:r>
-            <w:r>
-              <w:br/>
-            </w:r>
-            <w:r>
-              <w:rPr>
-                <w:rFonts w:ascii="Consolas" w:hAnsi="Consolas"/>
-                <w:color w:val="2C2C2B"/>
-                <w:sz w:val="17"/>
-              </w:rPr>
-              <w:t>→ Parent-context hydration → Evidence Gate</w:t>
-            </w:r>
-            <w:r>
-              <w:br/>
-            </w:r>
-            <w:r>
-              <w:rPr>
-                <w:rFonts w:ascii="Consolas" w:hAnsi="Consolas"/>
-                <w:color w:val="2C2C2B"/>
-                <w:sz w:val="17"/>
-              </w:rPr>
-              <w:t>→ Generation → Post-check số/vật liệu/mã/đơn vị/citation</w:t>
+              <w:t>Các nhánh có điều kiện: strict→broad cho mã kỹ thuật; HyDE một lần khi retrieval rỗng; SQL BOM khi có part/mechanical context; Voyage hoặc local rerank theo policy; parent hydration; heuristic Evidence Gate + optional verifier; generation; post-check cho câu hỏi high-risk.</w:t>
             </w:r>
           </w:p>
         </w:tc>
@@ -648,7 +512,7 @@
         <w:pStyle w:val="ListBullet"/>
       </w:pPr>
       <w:r>
-        <w:t>Filter fail-closed theo department, site, clearance, publication, lifecycle, current version và review status.</w:t>
+        <w:t>Filter retrieval theo department, site, clearance, publication, lifecycle, current version và review status theo hướng fail-closed với user thường; legacy admin hiện là ngoại lệ bypass department/security/site.</w:t>
       </w:r>
     </w:p>
     <w:p>
@@ -680,7 +544,7 @@
         <w:pStyle w:val="ListBullet"/>
       </w:pPr>
       <w:r>
-        <w:t>Citation dùng DocID + PageNo + Version + SourceID, tạo nền móng tốt cho claim verification.</w:t>
+        <w:t>Citation hiển thị file + PageNo + Version và canonical SourceID dạng D&lt;DocID&gt;P&lt;PageNo&gt;; version là metadata riêng, không nằm trong SourceID.</w:t>
       </w:r>
     </w:p>
     <w:p>
@@ -709,7 +573,7 @@
         <w:pStyle w:val="Heading3"/>
       </w:pPr>
       <w:r>
-        <w:t>B. Evidence Gate không phải nơi chặn nhiều nhất</w:t>
+        <w:t>B. Telemetry hiện chưa đủ để kết luận Evidence Gate là nút thắt</w:t>
       </w:r>
     </w:p>
     <w:tbl>
@@ -739,18 +603,8 @@
             </w:tcBorders>
           </w:tcPr>
           <w:p>
-            <w:pPr>
-              <w:spacing w:after="0" w:before="0"/>
-            </w:pPr>
-            <w:r/>
             <w:r>
-              <w:rPr>
-                <w:rFonts w:ascii="Arial" w:hAnsi="Arial"/>
-                <w:b/>
-                <w:color w:val="FFFFFF"/>
-                <w:sz w:val="18"/>
-              </w:rPr>
-              <w:t>Lý do từ chối</w:t>
+              <w:t>Lý do từ chối trong snapshot ngầm định</w:t>
             </w:r>
           </w:p>
         </w:tc>
@@ -769,17 +623,7 @@
             </w:tcBorders>
           </w:tcPr>
           <w:p>
-            <w:pPr>
-              <w:spacing w:after="0" w:before="0"/>
-            </w:pPr>
-            <w:r/>
             <w:r>
-              <w:rPr>
-                <w:rFonts w:ascii="Arial" w:hAnsi="Arial"/>
-                <w:b/>
-                <w:color w:val="FFFFFF"/>
-                <w:sz w:val="18"/>
-              </w:rPr>
               <w:t>Số lượt</w:t>
             </w:r>
           </w:p>
@@ -801,17 +645,7 @@
             </w:tcBorders>
           </w:tcPr>
           <w:p>
-            <w:pPr>
-              <w:spacing w:after="0" w:before="0"/>
-            </w:pPr>
-            <w:r/>
             <w:r>
-              <w:rPr>
-                <w:rFonts w:ascii="Arial" w:hAnsi="Arial"/>
-                <w:b w:val="0"/>
-                <w:color w:val="2C2C2B"/>
-                <w:sz w:val="18"/>
-              </w:rPr>
               <w:t>Không tìm thấy tài liệu</w:t>
             </w:r>
           </w:p>
@@ -831,17 +665,7 @@
             </w:tcBorders>
           </w:tcPr>
           <w:p>
-            <w:pPr>
-              <w:spacing w:after="0" w:before="0"/>
-            </w:pPr>
-            <w:r/>
             <w:r>
-              <w:rPr>
-                <w:rFonts w:ascii="Arial" w:hAnsi="Arial"/>
-                <w:b w:val="0"/>
-                <w:color w:val="2C2C2B"/>
-                <w:sz w:val="18"/>
-              </w:rPr>
               <w:t>257</w:t>
             </w:r>
           </w:p>
@@ -863,18 +687,8 @@
             </w:tcBorders>
           </w:tcPr>
           <w:p>
-            <w:pPr>
-              <w:spacing w:after="0" w:before="0"/>
-            </w:pPr>
-            <w:r/>
             <w:r>
-              <w:rPr>
-                <w:rFonts w:ascii="Arial" w:hAnsi="Arial"/>
-                <w:b w:val="0"/>
-                <w:color w:val="2C2C2B"/>
-                <w:sz w:val="18"/>
-              </w:rPr>
-              <w:t>Post-check số “không có nguồn”</w:t>
+              <w:t>Post-check số 'không có nguồn'</w:t>
             </w:r>
           </w:p>
         </w:tc>
@@ -893,17 +707,7 @@
             </w:tcBorders>
           </w:tcPr>
           <w:p>
-            <w:pPr>
-              <w:spacing w:after="0" w:before="0"/>
-            </w:pPr>
-            <w:r/>
             <w:r>
-              <w:rPr>
-                <w:rFonts w:ascii="Arial" w:hAnsi="Arial"/>
-                <w:b w:val="0"/>
-                <w:color w:val="2C2C2B"/>
-                <w:sz w:val="18"/>
-              </w:rPr>
               <w:t>174</w:t>
             </w:r>
           </w:p>
@@ -925,17 +729,7 @@
             </w:tcBorders>
           </w:tcPr>
           <w:p>
-            <w:pPr>
-              <w:spacing w:after="0" w:before="0"/>
-            </w:pPr>
-            <w:r/>
             <w:r>
-              <w:rPr>
-                <w:rFonts w:ascii="Arial" w:hAnsi="Arial"/>
-                <w:b w:val="0"/>
-                <w:color w:val="2C2C2B"/>
-                <w:sz w:val="18"/>
-              </w:rPr>
               <w:t>Không tìm thấy exact code</w:t>
             </w:r>
           </w:p>
@@ -955,17 +749,7 @@
             </w:tcBorders>
           </w:tcPr>
           <w:p>
-            <w:pPr>
-              <w:spacing w:after="0" w:before="0"/>
-            </w:pPr>
-            <w:r/>
             <w:r>
-              <w:rPr>
-                <w:rFonts w:ascii="Arial" w:hAnsi="Arial"/>
-                <w:b w:val="0"/>
-                <w:color w:val="2C2C2B"/>
-                <w:sz w:val="18"/>
-              </w:rPr>
               <w:t>117</w:t>
             </w:r>
           </w:p>
@@ -987,17 +771,7 @@
             </w:tcBorders>
           </w:tcPr>
           <w:p>
-            <w:pPr>
-              <w:spacing w:after="0" w:before="0"/>
-            </w:pPr>
-            <w:r/>
             <w:r>
-              <w:rPr>
-                <w:rFonts w:ascii="Arial" w:hAnsi="Arial"/>
-                <w:b w:val="0"/>
-                <w:color w:val="2C2C2B"/>
-                <w:sz w:val="18"/>
-              </w:rPr>
               <w:t>Nhiều candidate cần chọn</w:t>
             </w:r>
           </w:p>
@@ -1017,17 +791,7 @@
             </w:tcBorders>
           </w:tcPr>
           <w:p>
-            <w:pPr>
-              <w:spacing w:after="0" w:before="0"/>
-            </w:pPr>
-            <w:r/>
             <w:r>
-              <w:rPr>
-                <w:rFonts w:ascii="Arial" w:hAnsi="Arial"/>
-                <w:b w:val="0"/>
-                <w:color w:val="2C2C2B"/>
-                <w:sz w:val="18"/>
-              </w:rPr>
               <w:t>69</w:t>
             </w:r>
           </w:p>
@@ -1049,17 +813,7 @@
             </w:tcBorders>
           </w:tcPr>
           <w:p>
-            <w:pPr>
-              <w:spacing w:after="0" w:before="0"/>
-            </w:pPr>
-            <w:r/>
             <w:r>
-              <w:rPr>
-                <w:rFonts w:ascii="Arial" w:hAnsi="Arial"/>
-                <w:b w:val="0"/>
-                <w:color w:val="2C2C2B"/>
-                <w:sz w:val="18"/>
-              </w:rPr>
               <w:t>Lỗi LLM</w:t>
             </w:r>
           </w:p>
@@ -1079,17 +833,7 @@
             </w:tcBorders>
           </w:tcPr>
           <w:p>
-            <w:pPr>
-              <w:spacing w:after="0" w:before="0"/>
-            </w:pPr>
-            <w:r/>
             <w:r>
-              <w:rPr>
-                <w:rFonts w:ascii="Arial" w:hAnsi="Arial"/>
-                <w:b w:val="0"/>
-                <w:color w:val="2C2C2B"/>
-                <w:sz w:val="18"/>
-              </w:rPr>
               <w:t>28</w:t>
             </w:r>
           </w:p>
@@ -1111,17 +855,7 @@
             </w:tcBorders>
           </w:tcPr>
           <w:p>
-            <w:pPr>
-              <w:spacing w:after="0" w:before="0"/>
-            </w:pPr>
-            <w:r/>
             <w:r>
-              <w:rPr>
-                <w:rFonts w:ascii="Arial" w:hAnsi="Arial"/>
-                <w:b w:val="0"/>
-                <w:color w:val="2C2C2B"/>
-                <w:sz w:val="18"/>
-              </w:rPr>
               <w:t>Evidence Gate</w:t>
             </w:r>
           </w:p>
@@ -1141,17 +875,7 @@
             </w:tcBorders>
           </w:tcPr>
           <w:p>
-            <w:pPr>
-              <w:spacing w:after="0" w:before="0"/>
-            </w:pPr>
-            <w:r/>
             <w:r>
-              <w:rPr>
-                <w:rFonts w:ascii="Arial" w:hAnsi="Arial"/>
-                <w:b w:val="0"/>
-                <w:color w:val="2C2C2B"/>
-                <w:sz w:val="18"/>
-              </w:rPr>
               <w:t>14</w:t>
             </w:r>
           </w:p>
@@ -1173,17 +897,7 @@
             </w:tcBorders>
           </w:tcPr>
           <w:p>
-            <w:pPr>
-              <w:spacing w:after="0" w:before="0"/>
-            </w:pPr>
-            <w:r/>
             <w:r>
-              <w:rPr>
-                <w:rFonts w:ascii="Arial" w:hAnsi="Arial"/>
-                <w:b w:val="0"/>
-                <w:color w:val="2C2C2B"/>
-                <w:sz w:val="18"/>
-              </w:rPr>
               <w:t>Vật liệu/mã không hỗ trợ</w:t>
             </w:r>
           </w:p>
@@ -1203,17 +917,7 @@
             </w:tcBorders>
           </w:tcPr>
           <w:p>
-            <w:pPr>
-              <w:spacing w:after="0" w:before="0"/>
-            </w:pPr>
-            <w:r/>
             <w:r>
-              <w:rPr>
-                <w:rFonts w:ascii="Arial" w:hAnsi="Arial"/>
-                <w:b w:val="0"/>
-                <w:color w:val="2C2C2B"/>
-                <w:sz w:val="18"/>
-              </w:rPr>
               <w:t>2</w:t>
             </w:r>
           </w:p>
@@ -1227,7 +931,7 @@
     </w:p>
     <w:p>
       <w:r>
-        <w:t>Trong 1.126 lần chạy Evidence Gate: 1.112 pass và 14 block. Evidence Gate chỉ tạo khoảng 2% tổng refusal ghi nhận; post_check_numbers cao hơn hơn 12 lần.</w:t>
+        <w:t>Snapshot ngầm định trong bản gốc có thể tái lập khi cắt logs/rag_trace.jsonl tại Evidence Gate thứ 1.126 (2026-07-13T01:07:36.721243Z): 1.112 pass và 14 block. Tuy nhiên snapshot không ghi commit, môi trường, quy tắc loại test/cancel/null hay denominator; bảng còn bỏ 15 client_cancelled. Toàn log tại thời điểm review có 2.450 Evidence Gate (2.436 pass, 14 block), nhưng trộn trace test nên không thể dùng số đếm thô làm KPI production. Kết luận Evidence Gate ít block hơn post-check số vẫn là tín hiệu điều tra, chưa phải bằng chứng xác định ưu tiên.</w:t>
       </w:r>
     </w:p>
     <w:p>
@@ -1235,7 +939,7 @@
         <w:pStyle w:val="Heading3"/>
       </w:pPr>
       <w:r>
-        <w:t>C. has_unsupported_numbers() dễ tạo False Negative</w:t>
+        <w:t>C. has_unsupported_numbers() có nguy cơ tạo False Negative nhưng chưa được đo bằng ground truth</w:t>
       </w:r>
     </w:p>
     <w:p>
@@ -1280,7 +984,7 @@
     </w:p>
     <w:p>
       <w:r>
-        <w:t>Đây mới là so khớp token số, chưa phải kiểm chứng claim.</w:t>
+        <w:t>Implementation hiện so khớp token số, chưa phải kiểm chứng claim. Tuy vậy post-check chỉ chạy cho câu hỏi high-risk; các ví dụ trên là failure mode hợp lý cần test tái hiện, chưa phải false-negative đã được chứng minh bằng dữ liệu gán nhãn.</w:t>
       </w:r>
     </w:p>
     <w:p>
@@ -1288,12 +992,12 @@
         <w:pStyle w:val="Heading3"/>
       </w:pPr>
       <w:r>
-        <w:t>D. CRAG hiện mới tồn tại một phần</w:t>
+        <w:t>D. CRAG chưa tồn tại như một evaluator/loop hoàn chỉnh</w:t>
       </w:r>
     </w:p>
     <w:p>
       <w:r>
-        <w:t>Project đã có rewrite theo hội thoại, glossary expansion, strict → broad retrieval, HyDE khi rỗng, entity disambiguation và SQL BOM routing; tuy nhiên chưa có retrieval evaluator chính thức và chu trình retrieve → đánh giá → sửa chiến lược → retrieve lại → đánh giá lại.</w:t>
+        <w:t>Project đã có rewrite theo hội thoại, glossary expansion, strict → broad retrieval, HyDE khi rỗng, entity disambiguation và SQL BOM routing. Evidence Gate hiện là heuristic gate cộng optional LLM verifier; verifier mặc định tắt và lỗi verifier fail-open. Chưa có evaluator ba trạng thái hay chu trình retrieve → đánh giá → sửa chiến lược → retrieve lại → đánh giá lại.</w:t>
       </w:r>
     </w:p>
     <w:p>
@@ -1359,7 +1063,7 @@
     </w:p>
     <w:p>
       <w:r>
-        <w:t>Project đã có nhiều quan hệ đáng tin cậy trong SQL/metadata. Vì vậy nên xây Governed Knowledge Graph trước, không dựng full GraphRAG toàn corpus ngay:</w:t>
+        <w:t>Project đã có nhiều quan hệ đáng tin cậy trong SQL/metadata. Vì vậy nên xây Governed Knowledge Graph từ dữ liệu có cấu trúc trước, không dựng full GraphRAG toàn corpus ngay:</w:t>
       </w:r>
     </w:p>
     <w:tbl>
@@ -1525,49 +1229,8 @@
             </w:tcBorders>
           </w:tcPr>
           <w:p>
-            <w:pPr>
-              <w:spacing w:after="0"/>
-            </w:pPr>
             <w:r>
-              <w:rPr>
-                <w:rFonts w:ascii="Consolas" w:hAnsi="Consolas"/>
-                <w:color w:val="2C2C2B"/>
-                <w:sz w:val="17"/>
-              </w:rPr>
-              <w:t>Dense BGE-M3 + BM25</w:t>
-            </w:r>
-            <w:r>
-              <w:br/>
-            </w:r>
-            <w:r>
-              <w:rPr>
-                <w:rFonts w:ascii="Consolas" w:hAnsi="Consolas"/>
-                <w:color w:val="2C2C2B"/>
-                <w:sz w:val="17"/>
-              </w:rPr>
-              <w:t>→ RRF lấy 40–80 candidate</w:t>
-            </w:r>
-            <w:r>
-              <w:br/>
-            </w:r>
-            <w:r>
-              <w:rPr>
-                <w:rFonts w:ascii="Consolas" w:hAnsi="Consolas"/>
-                <w:color w:val="2C2C2B"/>
-                <w:sz w:val="17"/>
-              </w:rPr>
-              <w:t>→ BGE-M3 multi-vector hoặc ColBERT rerank</w:t>
-            </w:r>
-            <w:r>
-              <w:br/>
-            </w:r>
-            <w:r>
-              <w:rPr>
-                <w:rFonts w:ascii="Consolas" w:hAnsi="Consolas"/>
-                <w:color w:val="2C2C2B"/>
-                <w:sz w:val="17"/>
-              </w:rPr>
-              <w:t>→ lấy 8–20 context tốt nhất</w:t>
+              <w:t>Dense BGE-M3 + BM25 → RRF candidates → benchmark Voyage hiện tại với late-interaction reranker trên staging → chọn 8–20 context tốt nhất theo quality/latency/index-cost gates</w:t>
             </w:r>
           </w:p>
         </w:tc>
@@ -1583,7 +1246,7 @@
         <w:pStyle w:val="ListBullet"/>
       </w:pPr>
       <w:r>
-        <w:t>Pilot BGE-M3 multi-vector trước vì đã dùng BGE-M3, có tính multilingual và ít thay đổi semantic space.</w:t>
+        <w:t>Làm spike trước để xác minh BGE-M3 multi-vector output, Qdrant schema, client/wrapper support, chi phí index, latency và migration path; không mặc định đây là thay đổi nhỏ chỉ vì project đang dùng BGE-M3 dense.</w:t>
       </w:r>
     </w:p>
     <w:p>
@@ -1591,7 +1254,7 @@
         <w:pStyle w:val="ListBullet"/>
       </w:pPr>
       <w:r>
-        <w:t>Sau đó mới benchmark ColBERTv2/multilingual nếu BGE-M3 chưa đạt.</w:t>
+        <w:t>Benchmark ít nhất ba baseline: retrieval hiện tại, Voyage rerank hiện tại và một late-interaction reranker; chỉ thử ColBERTv2/multilingual hoặc BGE-M3 multi-vector sau khi spike chứng minh khả thi.</w:t>
       </w:r>
     </w:p>
     <w:p>
@@ -1599,7 +1262,7 @@
         <w:pStyle w:val="ListBullet"/>
       </w:pPr>
       <w:r>
-        <w:t>Tạo named vectors: dense, sparse, late_interaction.</w:t>
+        <w:t>Nếu pilot đạt yêu cầu, dùng collection staging/blue-green với vector schema rõ ràng; không sửa collection production tại chỗ.</w:t>
       </w:r>
     </w:p>
     <w:p>
@@ -1607,15 +1270,12 @@
         <w:pStyle w:val="ListBullet"/>
       </w:pPr>
       <w:r>
-        <w:t>Blue-green reindex; không sửa collection production tại chỗ.</w:t>
+        <w:t>Đánh giá Recall/nDCG, latency, dung lượng index và hiệu quả trên exact/near-code, thuật ngữ hiếm và OCR noise.</w:t>
       </w:r>
     </w:p>
     <w:p>
       <w:r>
-        <w:rPr>
-          <w:b/>
-        </w:rPr>
-        <w:t>Mức phù hợp: rất cao.</w:t>
+        <w:t>Mức phù hợp: cao về mặt bài toán, nhưng mức ưu tiên và lựa chọn model phụ thuộc benchmark.</w:t>
       </w:r>
     </w:p>
     <w:p>
@@ -1689,7 +1349,7 @@
     </w:p>
     <w:p>
       <w:r>
-        <w:t>CRAG nên chia retrieval thành SUFFICIENT, AMBIGUOUS và INSUFFICIENT thay vì một threshold Pass/Fail. Evaluator phải kết hợp exact match, dense/BM25 rank, RRF agreement, reranker score, score margin, document type, version, required-fact coverage, provenance và OCR quality.</w:t>
+        <w:t>Thiết kế mục tiêu có thể dùng ba trạng thái SUFFICIENT, AMBIGUOUS và INSUFFICIENT thay vì một ngưỡng Pass/Fail. Đây là thành phần mới, không phải mô tả Evidence Gate hiện hữu. Evaluator cần được hiệu chỉnh trên dữ liệu có nhãn và có thể kết hợp exact match, dense/BM25 rank, RRF agreement, reranker score, score margin, document type, version, required-fact coverage, provenance và OCR quality.</w:t>
       </w:r>
     </w:p>
     <w:tbl>
@@ -1836,10 +1496,7 @@
     </w:p>
     <w:p>
       <w:r>
-        <w:rPr>
-          <w:b/>
-        </w:rPr>
-        <w:t>Mức phù hợp: rất cao — nên làm đầu tiên.</w:t>
+        <w:t>Mức phù hợp: rất cao, nhưng P0 phải bắt đầu từ telemetry và labeled evaluation trước khi thêm correction loop.</w:t>
       </w:r>
     </w:p>
     <w:p>
@@ -2110,7 +1767,7 @@
         <w:pStyle w:val="Heading2"/>
       </w:pPr>
       <w:r>
-        <w:t>P0 — Giảm False Negative ngay</w:t>
+        <w:t>P0 — Chuẩn hóa bằng chứng đo lường</w:t>
       </w:r>
     </w:p>
     <w:p>
@@ -2118,7 +1775,7 @@
         <w:pStyle w:val="ListNumber"/>
       </w:pPr>
       <w:r>
-        <w:t>Ghi trace chi tiết claim/số bị block, source đáng lẽ hỗ trợ, retrieval pass và evaluator state.</w:t>
+        <w:t>Ghi commit, timestamp range, environment, trace source, cách deduplicate và quy tắc loại test/client_cancelled/null cho mọi bảng telemetry.</w:t>
       </w:r>
     </w:p>
     <w:p>
@@ -2126,7 +1783,7 @@
         <w:pStyle w:val="ListNumber"/>
       </w:pPr>
       <w:r>
-        <w:t>Thay has_unsupported_numbers() bằng normalize số/đơn vị, claim-level verification và deterministic calculation có provenance.</w:t>
+        <w:t>Tách trạng thái heuristic_pass/block, verifier_pass/block/fail_open và post-check reason; phân biệt production với test/eval trace.</w:t>
       </w:r>
     </w:p>
     <w:p>
@@ -2134,7 +1791,7 @@
         <w:pStyle w:val="ListNumber"/>
       </w:pPr>
       <w:r>
-        <w:t>Thêm CRAG tối đa hai correction pass.</w:t>
+        <w:t>Xây labeled set cho answerable-khó-retrieve, truly-unanswerable, format số, quy đổi đơn vị, phép tính có provenance, tổng BOM và citation/version.</w:t>
       </w:r>
     </w:p>
     <w:p>
@@ -2142,7 +1799,7 @@
         <w:pStyle w:val="ListNumber"/>
       </w:pPr>
       <w:r>
-        <w:t>Khi post-check fail, regenerate/repair một lần thay vì từ chối ngay.</w:t>
+        <w:t>Đo false-negative/false-positive thực tế của retrieval, Evidence Gate và post-check; chỉ đặt target sau khi có baseline.</w:t>
       </w:r>
     </w:p>
     <w:p>
@@ -2150,7 +1807,7 @@
         <w:pStyle w:val="ListNumber"/>
       </w:pPr>
       <w:r>
-        <w:t>Tách outcome thành full_answer, partial_answer, clarification_required, insufficient_evidence và access_denied.</w:t>
+        <w:t>Xác nhận legacy admin bypass là policy có chủ đích và bổ sung leakage test tương ứng.</w:t>
       </w:r>
     </w:p>
     <w:p>
@@ -2158,7 +1815,7 @@
         <w:pStyle w:val="Heading2"/>
       </w:pPr>
       <w:r>
-        <w:t>P1 — Late Interaction và decomposition</w:t>
+        <w:t>P1 — Correction/repair, Late Interaction và decomposition</w:t>
       </w:r>
     </w:p>
     <w:p>
@@ -2166,7 +1823,7 @@
         <w:pStyle w:val="ListNumber"/>
       </w:pPr>
       <w:r>
-        <w:t>Thêm named multivector và backfill trên staging.</w:t>
+        <w:t>Thêm evaluator ba trạng thái và tối đa hai correction pass, nhưng không nới RBAC/site/security/lifecycle/publication/current-version.</w:t>
       </w:r>
     </w:p>
     <w:p>
@@ -2174,7 +1831,7 @@
         <w:pStyle w:val="ListNumber"/>
       </w:pPr>
       <w:r>
-        <w:t>Rerank candidate sau RRF.</w:t>
+        <w:t>Khi post-check fail, thử claim-level repair một lần; normalize số/đơn vị và hỗ trợ phép tính deterministic có provenance.</w:t>
       </w:r>
     </w:p>
     <w:p>
@@ -2182,7 +1839,7 @@
         <w:pStyle w:val="ListNumber"/>
       </w:pPr>
       <w:r>
-        <w:t>Bật decomposition qua complex-query classifier.</w:t>
+        <w:t>Spike và benchmark late interaction sau RRF so với Voyage rerank hiện tại; chỉ backfill staging khi đạt tiêu chí.</w:t>
       </w:r>
     </w:p>
     <w:p>
@@ -2190,7 +1847,7 @@
         <w:pStyle w:val="ListNumber"/>
       </w:pPr>
       <w:r>
-        <w:t>Chạy subquery song song và hợp nhất bằng RRF/provenance.</w:t>
+        <w:t>Bật decomposition qua complex-query classifier; giới hạn 2–4 subquery, giữ provenance và kế thừa nguyên vẹn security filters.</w:t>
       </w:r>
     </w:p>
     <w:p>
@@ -2745,18 +2402,8 @@
             </w:tcBorders>
           </w:tcPr>
           <w:p>
-            <w:pPr>
-              <w:spacing w:after="0" w:before="0"/>
-            </w:pPr>
-            <w:r/>
             <w:r>
-              <w:rPr>
-                <w:rFonts w:ascii="Arial" w:hAnsi="Arial"/>
-                <w:b w:val="0"/>
-                <w:color w:val="2C2C2B"/>
-                <w:sz w:val="18"/>
-              </w:rPr>
-              <w:t>RBAC/lifecycle leakage = 0</w:t>
+              <w:t>Leakage theo role/site/clearance/lifecycle; báo riêng legacy admin exception</w:t>
             </w:r>
           </w:p>
         </w:tc>
@@ -2780,7 +2427,7 @@
         <w:pStyle w:val="ListBullet"/>
       </w:pPr>
       <w:r>
-        <w:t>Mục tiêu pilot: giảm ít nhất 50% post_check_numbers refusal sai.</w:t>
+        <w:t>Đặt mục tiêu giảm wrong-refusal sau khi có baseline gán nhãn; không dùng số lượng post_check_numbers thô làm đại diện false-negative.</w:t>
       </w:r>
     </w:p>
     <w:p>
@@ -2788,7 +2435,7 @@
         <w:pStyle w:val="ListBullet"/>
       </w:pPr>
       <w:r>
-        <w:t>Tăng answer-success trên tập answerable nhưng không tăng hallucination/leakage.</w:t>
+        <w:t>Tăng answer-success trên tập answerable nhưng không làm giảm claim precision, citation accuracy hoặc gây leakage.</w:t>
       </w:r>
     </w:p>
     <w:p>
@@ -2796,7 +2443,7 @@
         <w:pStyle w:val="ListBullet"/>
       </w:pPr>
       <w:r>
-        <w:t>Giới hạn CRAG tối đa hai correction pass và giữ p95 trong SLA.</w:t>
+        <w:t>Giới hạn CRAG tối đa hai correction pass, đặt timeout/cost budget và giữ p95 trong SLA đã thống nhất.</w:t>
       </w:r>
     </w:p>
     <w:p>
@@ -2836,17 +2483,7 @@
             </w:tcBorders>
           </w:tcPr>
           <w:p>
-            <w:pPr>
-              <w:spacing w:after="0" w:before="0"/>
-            </w:pPr>
-            <w:r/>
             <w:r>
-              <w:rPr>
-                <w:rFonts w:ascii="Arial" w:hAnsi="Arial"/>
-                <w:b/>
-                <w:color w:val="FFFFFF"/>
-                <w:sz w:val="18"/>
-              </w:rPr>
               <w:t>Phương pháp</w:t>
             </w:r>
           </w:p>
@@ -2866,17 +2503,7 @@
             </w:tcBorders>
           </w:tcPr>
           <w:p>
-            <w:pPr>
-              <w:spacing w:after="0" w:before="0"/>
-            </w:pPr>
-            <w:r/>
             <w:r>
-              <w:rPr>
-                <w:rFonts w:ascii="Arial" w:hAnsi="Arial"/>
-                <w:b/>
-                <w:color w:val="FFFFFF"/>
-                <w:sz w:val="18"/>
-              </w:rPr>
               <w:t>Mức phù hợp</w:t>
             </w:r>
           </w:p>
@@ -2896,17 +2523,7 @@
             </w:tcBorders>
           </w:tcPr>
           <w:p>
-            <w:pPr>
-              <w:spacing w:after="0" w:before="0"/>
-            </w:pPr>
-            <w:r/>
             <w:r>
-              <w:rPr>
-                <w:rFonts w:ascii="Arial" w:hAnsi="Arial"/>
-                <w:b/>
-                <w:color w:val="FFFFFF"/>
-                <w:sz w:val="18"/>
-              </w:rPr>
               <w:t>Ưu tiên</w:t>
             </w:r>
           </w:p>
@@ -2926,17 +2543,7 @@
             </w:tcBorders>
           </w:tcPr>
           <w:p>
-            <w:pPr>
-              <w:spacing w:after="0" w:before="0"/>
-            </w:pPr>
-            <w:r/>
             <w:r>
-              <w:rPr>
-                <w:rFonts w:ascii="Arial" w:hAnsi="Arial"/>
-                <w:b/>
-                <w:color w:val="FFFFFF"/>
-                <w:sz w:val="18"/>
-              </w:rPr>
               <w:t>Cách áp dụng</w:t>
             </w:r>
           </w:p>
@@ -2958,18 +2565,8 @@
             </w:tcBorders>
           </w:tcPr>
           <w:p>
-            <w:pPr>
-              <w:spacing w:after="0" w:before="0"/>
-            </w:pPr>
-            <w:r/>
             <w:r>
-              <w:rPr>
-                <w:rFonts w:ascii="Arial" w:hAnsi="Arial"/>
-                <w:b w:val="0"/>
-                <w:color w:val="2C2C2B"/>
-                <w:sz w:val="18"/>
-              </w:rPr>
-              <w:t>CRAG</w:t>
+              <w:t>Telemetry + labeled eval</w:t>
             </w:r>
           </w:p>
         </w:tc>
@@ -2988,18 +2585,8 @@
             </w:tcBorders>
           </w:tcPr>
           <w:p>
-            <w:pPr>
-              <w:spacing w:after="0" w:before="0"/>
-            </w:pPr>
-            <w:r/>
             <w:r>
-              <w:rPr>
-                <w:rFonts w:ascii="Arial" w:hAnsi="Arial"/>
-                <w:b w:val="0"/>
-                <w:color w:val="2C2C2B"/>
-                <w:sz w:val="18"/>
-              </w:rPr>
-              <w:t>Rất phù hợp</w:t>
+              <w:t>Bắt buộc</w:t>
             </w:r>
           </w:p>
         </w:tc>
@@ -3018,17 +2605,7 @@
             </w:tcBorders>
           </w:tcPr>
           <w:p>
-            <w:pPr>
-              <w:spacing w:after="0" w:before="0"/>
-            </w:pPr>
-            <w:r/>
             <w:r>
-              <w:rPr>
-                <w:rFonts w:ascii="Arial" w:hAnsi="Arial"/>
-                <w:b w:val="0"/>
-                <w:color w:val="2C2C2B"/>
-                <w:sz w:val="18"/>
-              </w:rPr>
               <w:t>P0</w:t>
             </w:r>
           </w:p>
@@ -3048,18 +2625,8 @@
             </w:tcBorders>
           </w:tcPr>
           <w:p>
-            <w:pPr>
-              <w:spacing w:after="0" w:before="0"/>
-            </w:pPr>
-            <w:r/>
             <w:r>
-              <w:rPr>
-                <w:rFonts w:ascii="Arial" w:hAnsi="Arial"/>
-                <w:b w:val="0"/>
-                <w:color w:val="2C2C2B"/>
-                <w:sz w:val="18"/>
-              </w:rPr>
-              <w:t>Evaluator 3 trạng thái, tối đa 2 correction pass</w:t>
+              <w:t>Snapshot tái lập, tách production/test, đo wrong-refusal</w:t>
             </w:r>
           </w:p>
         </w:tc>
@@ -3080,18 +2647,8 @@
             </w:tcBorders>
           </w:tcPr>
           <w:p>
-            <w:pPr>
-              <w:spacing w:after="0" w:before="0"/>
-            </w:pPr>
-            <w:r/>
             <w:r>
-              <w:rPr>
-                <w:rFonts w:ascii="Arial" w:hAnsi="Arial"/>
-                <w:b w:val="0"/>
-                <w:color w:val="2C2C2B"/>
-                <w:sz w:val="18"/>
-              </w:rPr>
-              <w:t>ColBERT / BGE-M3 multi-vector</w:t>
+              <w:t>CRAG / claim repair</w:t>
             </w:r>
           </w:p>
         </w:tc>
@@ -3110,17 +2667,7 @@
             </w:tcBorders>
           </w:tcPr>
           <w:p>
-            <w:pPr>
-              <w:spacing w:after="0" w:before="0"/>
-            </w:pPr>
-            <w:r/>
             <w:r>
-              <w:rPr>
-                <w:rFonts w:ascii="Arial" w:hAnsi="Arial"/>
-                <w:b w:val="0"/>
-                <w:color w:val="2C2C2B"/>
-                <w:sz w:val="18"/>
-              </w:rPr>
               <w:t>Rất phù hợp</w:t>
             </w:r>
           </w:p>
@@ -3140,17 +2687,7 @@
             </w:tcBorders>
           </w:tcPr>
           <w:p>
-            <w:pPr>
-              <w:spacing w:after="0" w:before="0"/>
-            </w:pPr>
-            <w:r/>
             <w:r>
-              <w:rPr>
-                <w:rFonts w:ascii="Arial" w:hAnsi="Arial"/>
-                <w:b w:val="0"/>
-                <w:color w:val="2C2C2B"/>
-                <w:sz w:val="18"/>
-              </w:rPr>
               <w:t>P0/P1</w:t>
             </w:r>
           </w:p>
@@ -3170,18 +2707,8 @@
             </w:tcBorders>
           </w:tcPr>
           <w:p>
-            <w:pPr>
-              <w:spacing w:after="0" w:before="0"/>
-            </w:pPr>
-            <w:r/>
             <w:r>
-              <w:rPr>
-                <w:rFonts w:ascii="Arial" w:hAnsi="Arial"/>
-                <w:b w:val="0"/>
-                <w:color w:val="2C2C2B"/>
-                <w:sz w:val="18"/>
-              </w:rPr>
-              <w:t>Rerank sau dense + BM25 + RRF</w:t>
+              <w:t>Evaluator 3 trạng thái, tối đa 2 correction pass</w:t>
             </w:r>
           </w:p>
         </w:tc>
@@ -3202,18 +2729,8 @@
             </w:tcBorders>
           </w:tcPr>
           <w:p>
-            <w:pPr>
-              <w:spacing w:after="0" w:before="0"/>
-            </w:pPr>
-            <w:r/>
             <w:r>
-              <w:rPr>
-                <w:rFonts w:ascii="Arial" w:hAnsi="Arial"/>
-                <w:b w:val="0"/>
-                <w:color w:val="2C2C2B"/>
-                <w:sz w:val="18"/>
-              </w:rPr>
-              <w:t>Agentic decomposition</w:t>
+              <w:t>Late interaction</w:t>
             </w:r>
           </w:p>
         </w:tc>
@@ -3232,18 +2749,8 @@
             </w:tcBorders>
           </w:tcPr>
           <w:p>
-            <w:pPr>
-              <w:spacing w:after="0" w:before="0"/>
-            </w:pPr>
-            <w:r/>
             <w:r>
-              <w:rPr>
-                <w:rFonts w:ascii="Arial" w:hAnsi="Arial"/>
-                <w:b w:val="0"/>
-                <w:color w:val="2C2C2B"/>
-                <w:sz w:val="18"/>
-              </w:rPr>
-              <w:t>Có điều kiện</w:t>
+              <w:t>Phù hợp nếu benchmark đạt</w:t>
             </w:r>
           </w:p>
         </w:tc>
@@ -3262,17 +2769,7 @@
             </w:tcBorders>
           </w:tcPr>
           <w:p>
-            <w:pPr>
-              <w:spacing w:after="0" w:before="0"/>
-            </w:pPr>
-            <w:r/>
             <w:r>
-              <w:rPr>
-                <w:rFonts w:ascii="Arial" w:hAnsi="Arial"/>
-                <w:b w:val="0"/>
-                <w:color w:val="2C2C2B"/>
-                <w:sz w:val="18"/>
-              </w:rPr>
               <w:t>P1</w:t>
             </w:r>
           </w:p>
@@ -3292,18 +2789,8 @@
             </w:tcBorders>
           </w:tcPr>
           <w:p>
-            <w:pPr>
-              <w:spacing w:after="0" w:before="0"/>
-            </w:pPr>
-            <w:r/>
             <w:r>
-              <w:rPr>
-                <w:rFonts w:ascii="Arial" w:hAnsi="Arial"/>
-                <w:b w:val="0"/>
-                <w:color w:val="2C2C2B"/>
-                <w:sz w:val="18"/>
-              </w:rPr>
-              <w:t>Chỉ cho multi-intent/multi-source</w:t>
+              <w:t>Spike schema/client; so với Voyage sau RRF</w:t>
             </w:r>
           </w:p>
         </w:tc>
@@ -3324,18 +2811,8 @@
             </w:tcBorders>
           </w:tcPr>
           <w:p>
-            <w:pPr>
-              <w:spacing w:after="0" w:before="0"/>
-            </w:pPr>
-            <w:r/>
             <w:r>
-              <w:rPr>
-                <w:rFonts w:ascii="Arial" w:hAnsi="Arial"/>
-                <w:b w:val="0"/>
-                <w:color w:val="2C2C2B"/>
-                <w:sz w:val="18"/>
-              </w:rPr>
-              <w:t>GraphRAG</w:t>
+              <w:t>Agentic decomposition</w:t>
             </w:r>
           </w:p>
         </w:tc>
@@ -3354,18 +2831,8 @@
             </w:tcBorders>
           </w:tcPr>
           <w:p>
-            <w:pPr>
-              <w:spacing w:after="0" w:before="0"/>
-            </w:pPr>
-            <w:r/>
             <w:r>
-              <w:rPr>
-                <w:rFonts w:ascii="Arial" w:hAnsi="Arial"/>
-                <w:b w:val="0"/>
-                <w:color w:val="2C2C2B"/>
-                <w:sz w:val="18"/>
-              </w:rPr>
-              <w:t>Chọn lọc</w:t>
+              <w:t>Có điều kiện</w:t>
             </w:r>
           </w:p>
         </w:tc>
@@ -3384,18 +2851,8 @@
             </w:tcBorders>
           </w:tcPr>
           <w:p>
-            <w:pPr>
-              <w:spacing w:after="0" w:before="0"/>
-            </w:pPr>
-            <w:r/>
             <w:r>
-              <w:rPr>
-                <w:rFonts w:ascii="Arial" w:hAnsi="Arial"/>
-                <w:b w:val="0"/>
-                <w:color w:val="2C2C2B"/>
-                <w:sz w:val="18"/>
-              </w:rPr>
-              <w:t>P2</w:t>
+              <w:t>P1</w:t>
             </w:r>
           </w:p>
         </w:tc>
@@ -3414,17 +2871,49 @@
             </w:tcBorders>
           </w:tcPr>
           <w:p>
-            <w:pPr>
-              <w:spacing w:after="0" w:before="0"/>
-            </w:pPr>
-            <w:r/>
             <w:r>
-              <w:rPr>
-                <w:rFonts w:ascii="Arial" w:hAnsi="Arial"/>
-                <w:b w:val="0"/>
-                <w:color w:val="2C2C2B"/>
-                <w:sz w:val="18"/>
-              </w:rPr>
+              <w:t>Chỉ cho multi-intent/multi-source</w:t>
+            </w:r>
+          </w:p>
+        </w:tc>
+      </w:tr>
+      <w:tr>
+        <w:tc>
+          <w:tcPr>
+            <w:tcW w:type="dxa" w:w="2498"/>
+          </w:tcPr>
+          <w:p>
+            <w:r>
+              <w:t>GraphRAG</w:t>
+            </w:r>
+          </w:p>
+        </w:tc>
+        <w:tc>
+          <w:tcPr>
+            <w:tcW w:type="dxa" w:w="2498"/>
+          </w:tcPr>
+          <w:p>
+            <w:r>
+              <w:t>Chọn lọc</w:t>
+            </w:r>
+          </w:p>
+        </w:tc>
+        <w:tc>
+          <w:tcPr>
+            <w:tcW w:type="dxa" w:w="2498"/>
+          </w:tcPr>
+          <w:p>
+            <w:r>
+              <w:t>P2</w:t>
+            </w:r>
+          </w:p>
+        </w:tc>
+        <w:tc>
+          <w:tcPr>
+            <w:tcW w:type="dxa" w:w="2498"/>
+          </w:tcPr>
+          <w:p>
+            <w:r>
               <w:t>Governed graph từ SQL/metadata; route riêng</w:t>
             </w:r>
           </w:p>
@@ -3435,6 +2924,9 @@
       <w:pPr>
         <w:spacing w:after="0"/>
       </w:pPr>
+      <w:r>
+        <w:t>Giữ hướng chiến lược của bản gốc nhưng thay P0 thành telemetry + labeled evaluation. Chỉ triển khai CRAG/repair sau khi tái hiện được wrong-refusal; chỉ chọn BGE-M3 multi-vector hoặc ColBERT sau benchmark; GraphRAG tiếp tục là route P2 cho truy vấn quan hệ/tổng hợp.</w:t>
+      </w:r>
     </w:p>
     <w:tbl>
       <w:tblPr>
@@ -3460,13 +2952,7 @@
           </w:tcPr>
           <w:p>
             <w:r>
-              <w:rPr>
-                <w:b/>
-              </w:rPr>
-              <w:t xml:space="preserve">Khuyến nghị trọng tâm: </w:t>
-            </w:r>
-            <w:r>
-              <w:t>Không nới Evidence Gate toàn cục. Hãy chuyển từ một ngưỡng Pass/Fail sang adaptive retrieval + claim-level verification + repair để giảm False Negative mà không đổi lấy False Positive.</w:t>
+              <w:t>Khuyến nghị trọng tâm: Không nới Evidence Gate toàn cục. Trước hết chuẩn hóa telemetry và labeled evaluation; sau đó mới thêm adaptive retrieval, claim-level verification và repair để giảm wrong-refusal mà không đổi lấy hallucination hoặc leakage.</w:t>
             </w:r>
           </w:p>
         </w:tc>

</xml_diff>